<commit_message>
Start AC l2 and rework how assessment objectives are displayed
</commit_message>
<xml_diff>
--- a/01_Implementation/CMMCFledge_Helpful_Links.docx
+++ b/01_Implementation/CMMCFledge_Helpful_Links.docx
@@ -43,9 +43,11 @@
     </w:p>
     <w:p/>
     <w:p>
+      <w:proofErr w:type="gramStart"/>
       <w:r>
         <w:t>AWS Best Practices</w:t>
       </w:r>
+      <w:proofErr w:type="gramEnd"/>
     </w:p>
     <w:p>
       <w:hyperlink r:id="rId6">
@@ -188,21 +190,123 @@
             <w:color w:val="1155CC"/>
             <w:u w:val="single"/>
           </w:rPr>
-          <w:t>https://dodcio.defense.gov/Portals/0/Documents/CMMC/CMMC-LevelsDeterminationBrief.pdf?utm_source=chatgpt.com</w:t>
+          <w:t>https://dodcio.defense.gov/Portals/0/Documents/CMMC/CMM</w:t>
+        </w:r>
+        <w:r>
+          <w:rPr>
+            <w:color w:val="1155CC"/>
+            <w:u w:val="single"/>
+          </w:rPr>
+          <w:t>C</w:t>
+        </w:r>
+        <w:r>
+          <w:rPr>
+            <w:color w:val="1155CC"/>
+            <w:u w:val="single"/>
+          </w:rPr>
+          <w:t>-LevelsDeterminationBrief.pdf?</w:t>
         </w:r>
       </w:hyperlink>
       <w:r>
         <w:t xml:space="preserve"> </w:t>
       </w:r>
+      <w:r>
+        <w:t xml:space="preserve"> </w:t>
+      </w:r>
     </w:p>
     <w:p/>
     <w:p>
+      <w:r>
+        <w:t>About CMMC</w:t>
+      </w:r>
+    </w:p>
+    <w:p>
       <w:hyperlink r:id="rId14" w:history="1">
         <w:r>
           <w:rPr>
             <w:rStyle w:val="Hyperlink"/>
           </w:rPr>
-          <w:t>https://dodcio.defense.gov/CMMC/about/</w:t>
+          <w:t>https://dodcio</w:t>
+        </w:r>
+        <w:r>
+          <w:rPr>
+            <w:rStyle w:val="Hyperlink"/>
+          </w:rPr>
+          <w:t>.</w:t>
+        </w:r>
+        <w:r>
+          <w:rPr>
+            <w:rStyle w:val="Hyperlink"/>
+          </w:rPr>
+          <w:t>defense.gov/CMMC/about/</w:t>
+        </w:r>
+      </w:hyperlink>
+      <w:r>
+        <w:t xml:space="preserve"> </w:t>
+      </w:r>
+    </w:p>
+    <w:p/>
+    <w:p>
+      <w:proofErr w:type="spellStart"/>
+      <w:r>
+        <w:t>CyberA</w:t>
+      </w:r>
+      <w:r>
+        <w:t>s</w:t>
+      </w:r>
+      <w:r>
+        <w:t>sist</w:t>
+      </w:r>
+      <w:proofErr w:type="spellEnd"/>
+      <w:r>
+        <w:t xml:space="preserve"> Controls</w:t>
+      </w:r>
+    </w:p>
+    <w:p>
+      <w:hyperlink r:id="rId15" w:history="1">
+        <w:r>
+          <w:rPr>
+            <w:rStyle w:val="Hyperlink"/>
+          </w:rPr>
+          <w:t>https://ndisac.org/dibscc/cyberassist/cybersecurity-maturity-model-certification/level-2/</w:t>
+        </w:r>
+      </w:hyperlink>
+      <w:r>
+        <w:t xml:space="preserve"> </w:t>
+      </w:r>
+    </w:p>
+    <w:p/>
+    <w:p>
+      <w:r>
+        <w:t>Microsoft L2 AC configurations</w:t>
+      </w:r>
+    </w:p>
+    <w:p>
+      <w:hyperlink r:id="rId16" w:history="1">
+        <w:r>
+          <w:rPr>
+            <w:rStyle w:val="Hyperlink"/>
+          </w:rPr>
+          <w:t>https://learn.microsoft.com/en-us/entra/standards/configure-cmmc-level-2-access-control</w:t>
+        </w:r>
+      </w:hyperlink>
+      <w:r>
+        <w:t xml:space="preserve"> </w:t>
+      </w:r>
+    </w:p>
+    <w:p/>
+    <w:p>
+      <w:r>
+        <w:t xml:space="preserve">SSL VPN guide </w:t>
+      </w:r>
+    </w:p>
+    <w:p>
+      <w:hyperlink r:id="rId17" w:history="1">
+        <w:r>
+          <w:rPr>
+            <w:rStyle w:val="Hyperlink"/>
+          </w:rPr>
+          <w:t>https://nvlpubs.nist.gov/nistpubs/Legacy/SP/nistspecialpublication800-113.pdf</w:t>
         </w:r>
       </w:hyperlink>
       <w:r>
@@ -825,6 +929,18 @@
       <w:shd w:val="clear" w:color="auto" w:fill="E1DFDD"/>
     </w:rPr>
   </w:style>
+  <w:style w:type="character" w:styleId="FollowedHyperlink">
+    <w:name w:val="FollowedHyperlink"/>
+    <w:basedOn w:val="DefaultParagraphFont"/>
+    <w:uiPriority w:val="99"/>
+    <w:semiHidden/>
+    <w:unhideWhenUsed/>
+    <w:rsid w:val="001F4C81"/>
+    <w:rPr>
+      <w:color w:val="800080" w:themeColor="followedHyperlink"/>
+      <w:u w:val="single"/>
+    </w:rPr>
+  </w:style>
 </w:styles>
 </file>
 

</xml_diff>